<commit_message>
Updates for Bootstrap 4; Added hidden filter row; Currently working.
</commit_message>
<xml_diff>
--- a/TurboTables-DesignNotes.docx
+++ b/TurboTables-DesignNotes.docx
@@ -1,6 +1,6 @@
 
 <file path=word/document.xml><?xml version="1.0" encoding="utf-8"?>
-<w:document xmlns:wpc="http://schemas.microsoft.com/office/word/2010/wordprocessingCanvas" xmlns:cx="http://schemas.microsoft.com/office/drawing/2014/chartex" xmlns:cx1="http://schemas.microsoft.com/office/drawing/2015/9/8/chartex" xmlns:cx2="http://schemas.microsoft.com/office/drawing/2015/10/21/chartex" xmlns:cx3="http://schemas.microsoft.com/office/drawing/2016/5/9/chartex" xmlns:cx4="http://schemas.microsoft.com/office/drawing/2016/5/10/chartex" xmlns:cx5="http://schemas.microsoft.com/office/drawing/2016/5/11/chartex" xmlns:mc="http://schemas.openxmlformats.org/markup-compatibility/2006" xmlns:o="urn:schemas-microsoft-com:office:office" xmlns:r="http://schemas.openxmlformats.org/officeDocument/2006/relationships" xmlns:m="http://schemas.openxmlformats.org/officeDocument/2006/math" xmlns:v="urn:schemas-microsoft-com:vml" xmlns:wp14="http://schemas.microsoft.com/office/word/2010/wordprocessingDrawing" xmlns:wp="http://schemas.openxmlformats.org/drawingml/2006/wordprocessingDrawing" xmlns:w10="urn:schemas-microsoft-com:office:word" xmlns:w="http://schemas.openxmlformats.org/wordprocessingml/2006/main" xmlns:w14="http://schemas.microsoft.com/office/word/2010/wordml" xmlns:w15="http://schemas.microsoft.com/office/word/2012/wordml" xmlns:w16se="http://schemas.microsoft.com/office/word/2015/wordml/symex" xmlns:wpg="http://schemas.microsoft.com/office/word/2010/wordprocessingGroup" xmlns:wpi="http://schemas.microsoft.com/office/word/2010/wordprocessingInk" xmlns:wne="http://schemas.microsoft.com/office/word/2006/wordml" xmlns:wps="http://schemas.microsoft.com/office/word/2010/wordprocessingShape" mc:Ignorable="w14 w15 w16se wp14">
+<w:document xmlns:wpc="http://schemas.microsoft.com/office/word/2010/wordprocessingCanvas" xmlns:cx="http://schemas.microsoft.com/office/drawing/2014/chartex" xmlns:cx1="http://schemas.microsoft.com/office/drawing/2015/9/8/chartex" xmlns:cx2="http://schemas.microsoft.com/office/drawing/2015/10/21/chartex" xmlns:cx3="http://schemas.microsoft.com/office/drawing/2016/5/9/chartex" xmlns:cx4="http://schemas.microsoft.com/office/drawing/2016/5/10/chartex" xmlns:cx5="http://schemas.microsoft.com/office/drawing/2016/5/11/chartex" xmlns:cx6="http://schemas.microsoft.com/office/drawing/2016/5/12/chartex" xmlns:cx7="http://schemas.microsoft.com/office/drawing/2016/5/13/chartex" xmlns:cx8="http://schemas.microsoft.com/office/drawing/2016/5/14/chartex" xmlns:mc="http://schemas.openxmlformats.org/markup-compatibility/2006" xmlns:aink="http://schemas.microsoft.com/office/drawing/2016/ink" xmlns:am3d="http://schemas.microsoft.com/office/drawing/2017/model3d" xmlns:o="urn:schemas-microsoft-com:office:office" xmlns:r="http://schemas.openxmlformats.org/officeDocument/2006/relationships" xmlns:m="http://schemas.openxmlformats.org/officeDocument/2006/math" xmlns:v="urn:schemas-microsoft-com:vml" xmlns:wp14="http://schemas.microsoft.com/office/word/2010/wordprocessingDrawing" xmlns:wp="http://schemas.openxmlformats.org/drawingml/2006/wordprocessingDrawing" xmlns:w10="urn:schemas-microsoft-com:office:word" xmlns:w="http://schemas.openxmlformats.org/wordprocessingml/2006/main" xmlns:w14="http://schemas.microsoft.com/office/word/2010/wordml" xmlns:w15="http://schemas.microsoft.com/office/word/2012/wordml" xmlns:w16cid="http://schemas.microsoft.com/office/word/2016/wordml/cid" xmlns:w16se="http://schemas.microsoft.com/office/word/2015/wordml/symex" xmlns:wpg="http://schemas.microsoft.com/office/word/2010/wordprocessingGroup" xmlns:wpi="http://schemas.microsoft.com/office/word/2010/wordprocessingInk" xmlns:wne="http://schemas.microsoft.com/office/word/2006/wordml" xmlns:wps="http://schemas.microsoft.com/office/word/2010/wordprocessingShape" mc:Ignorable="w14 w15 w16se w16cid wp14">
   <w:body>
     <w:p>
       <w:r>
@@ -727,15 +727,7 @@
         <w:ind w:left="1080"/>
       </w:pPr>
       <w:r>
-        <w:t>&lt;</w:t>
-      </w:r>
-      <w:proofErr w:type="spellStart"/>
-      <w:r>
-        <w:t>tr</w:t>
-      </w:r>
-      <w:proofErr w:type="spellEnd"/>
-      <w:r>
-        <w:t xml:space="preserve"> class=”</w:t>
+        <w:t>&lt;tr class=”</w:t>
       </w:r>
       <w:proofErr w:type="spellStart"/>
       <w:r>
@@ -856,15 +848,7 @@
       </w:r>
       <w:proofErr w:type="spellEnd"/>
       <w:r>
-        <w:t xml:space="preserve"> id=”</w:t>
-      </w:r>
-      <w:proofErr w:type="spellStart"/>
-      <w:r>
-        <w:t>FirstName</w:t>
-      </w:r>
-      <w:proofErr w:type="spellEnd"/>
-      <w:r>
-        <w:t>”</w:t>
+        <w:t xml:space="preserve"> id=”FirstName”</w:t>
       </w:r>
       <w:r>
         <w:t xml:space="preserve"> class=”sortable”</w:t>
@@ -1142,15 +1126,7 @@
         <w:ind w:left="1080"/>
       </w:pPr>
       <w:r>
-        <w:t>&lt;/</w:t>
-      </w:r>
-      <w:proofErr w:type="spellStart"/>
-      <w:r>
-        <w:t>tr</w:t>
-      </w:r>
-      <w:proofErr w:type="spellEnd"/>
-      <w:r>
-        <w:t>&gt;</w:t>
+        <w:t>&lt;/tr&gt;</w:t>
       </w:r>
     </w:p>
     <w:p>
@@ -1244,13 +1220,8 @@
         <w:spacing w:after="0"/>
         <w:ind w:left="720"/>
       </w:pPr>
-      <w:proofErr w:type="spellStart"/>
-      <w:r>
-        <w:t>var</w:t>
-      </w:r>
-      <w:proofErr w:type="spellEnd"/>
-      <w:r>
-        <w:t xml:space="preserve"> pager = new </w:t>
+      <w:r>
+        <w:t xml:space="preserve">var pager = new </w:t>
       </w:r>
       <w:proofErr w:type="spellStart"/>
       <w:r>
@@ -1542,6 +1513,236 @@
         <w:pStyle w:val="Heading1"/>
       </w:pPr>
       <w:r>
+        <w:t>Layout</w:t>
+      </w:r>
+    </w:p>
+    <w:p>
+      <w:pPr>
+        <w:spacing w:after="0"/>
+      </w:pPr>
+      <w:r>
+        <w:tab/>
+        <w:t>&lt;div class</w:t>
+      </w:r>
+      <w:proofErr w:type="gramStart"/>
+      <w:r>
+        <w:t>=”row</w:t>
+      </w:r>
+      <w:proofErr w:type="gramEnd"/>
+      <w:r>
+        <w:t>”&gt;</w:t>
+      </w:r>
+    </w:p>
+    <w:p>
+      <w:pPr>
+        <w:spacing w:after="0"/>
+      </w:pPr>
+      <w:r>
+        <w:tab/>
+      </w:r>
+      <w:r>
+        <w:tab/>
+        <w:t>&lt;div class</w:t>
+      </w:r>
+      <w:proofErr w:type="gramStart"/>
+      <w:r>
+        <w:t>=”col</w:t>
+      </w:r>
+      <w:proofErr w:type="gramEnd"/>
+      <w:r>
+        <w:t>-4”&gt;</w:t>
+      </w:r>
+    </w:p>
+    <w:p>
+      <w:pPr>
+        <w:spacing w:after="0"/>
+        <w:ind w:left="1440" w:firstLine="720"/>
+      </w:pPr>
+      <w:r>
+        <w:t>&lt;Filter Icon&gt;</w:t>
+      </w:r>
+    </w:p>
+    <w:p>
+      <w:pPr>
+        <w:spacing w:after="0"/>
+      </w:pPr>
+      <w:r>
+        <w:tab/>
+      </w:r>
+      <w:r>
+        <w:tab/>
+      </w:r>
+      <w:r>
+        <w:tab/>
+        <w:t>&lt;Label&gt;Showing&lt;/Label&gt;</w:t>
+      </w:r>
+    </w:p>
+    <w:p>
+      <w:pPr>
+        <w:spacing w:after="0"/>
+      </w:pPr>
+      <w:r>
+        <w:tab/>
+      </w:r>
+      <w:r>
+        <w:tab/>
+        <w:t>&lt;/div&gt;</w:t>
+      </w:r>
+    </w:p>
+    <w:p>
+      <w:pPr>
+        <w:spacing w:after="0"/>
+        <w:ind w:left="720" w:firstLine="720"/>
+      </w:pPr>
+      <w:r>
+        <w:t>&lt;form clas</w:t>
+      </w:r>
+      <w:bookmarkStart w:id="0" w:name="_GoBack"/>
+      <w:bookmarkEnd w:id="0"/>
+      <w:r>
+        <w:t>s</w:t>
+      </w:r>
+      <w:proofErr w:type="gramStart"/>
+      <w:r>
+        <w:t>=”col</w:t>
+      </w:r>
+      <w:proofErr w:type="gramEnd"/>
+      <w:r>
+        <w:t>-8”&gt;</w:t>
+      </w:r>
+    </w:p>
+    <w:p>
+      <w:pPr>
+        <w:spacing w:after="0"/>
+        <w:ind w:left="720" w:firstLine="720"/>
+      </w:pPr>
+      <w:r>
+        <w:tab/>
+        <w:t>&lt;Input placeholder</w:t>
+      </w:r>
+      <w:proofErr w:type="gramStart"/>
+      <w:r>
+        <w:t>=”Search</w:t>
+      </w:r>
+      <w:proofErr w:type="gramEnd"/>
+      <w:r>
+        <w:t>” /&gt;</w:t>
+      </w:r>
+    </w:p>
+    <w:p>
+      <w:pPr>
+        <w:spacing w:after="0"/>
+        <w:ind w:left="720" w:firstLine="720"/>
+      </w:pPr>
+      <w:r>
+        <w:t>&lt;/form&gt;</w:t>
+      </w:r>
+    </w:p>
+    <w:p>
+      <w:pPr>
+        <w:ind w:firstLine="720"/>
+      </w:pPr>
+      <w:r>
+        <w:t>&lt;/div&gt;</w:t>
+      </w:r>
+    </w:p>
+    <w:p>
+      <w:pPr>
+        <w:ind w:firstLine="720"/>
+      </w:pPr>
+      <w:r>
+        <w:t>&lt;div class</w:t>
+      </w:r>
+      <w:proofErr w:type="gramStart"/>
+      <w:r>
+        <w:t>=”row</w:t>
+      </w:r>
+      <w:proofErr w:type="gramEnd"/>
+      <w:r>
+        <w:t xml:space="preserve"> hidden”&gt;</w:t>
+      </w:r>
+    </w:p>
+    <w:p>
+      <w:pPr>
+        <w:ind w:firstLine="720"/>
+      </w:pPr>
+      <w:r>
+        <w:tab/>
+        <w:t>&lt;Filter Field Dropdown&gt;</w:t>
+      </w:r>
+    </w:p>
+    <w:p>
+      <w:pPr>
+        <w:ind w:firstLine="720"/>
+      </w:pPr>
+      <w:r>
+        <w:tab/>
+        <w:t>&lt;Filter Value Input&gt;</w:t>
+      </w:r>
+    </w:p>
+    <w:p>
+      <w:pPr>
+        <w:ind w:firstLine="720"/>
+      </w:pPr>
+      <w:r>
+        <w:tab/>
+        <w:t>&lt;clear button&gt;</w:t>
+      </w:r>
+    </w:p>
+    <w:p>
+      <w:pPr>
+        <w:ind w:firstLine="720"/>
+      </w:pPr>
+      <w:r>
+        <w:tab/>
+        <w:t>&lt;filter button&gt;</w:t>
+      </w:r>
+    </w:p>
+    <w:p>
+      <w:pPr>
+        <w:ind w:firstLine="720"/>
+      </w:pPr>
+      <w:r>
+        <w:t>&lt;/div&gt;</w:t>
+      </w:r>
+    </w:p>
+    <w:p>
+      <w:pPr>
+        <w:ind w:firstLine="720"/>
+      </w:pPr>
+      <w:r>
+        <w:t>&lt;table&gt;</w:t>
+      </w:r>
+    </w:p>
+    <w:p>
+      <w:pPr>
+        <w:ind w:firstLine="720"/>
+      </w:pPr>
+      <w:r>
+        <w:t>&lt;/table&gt;</w:t>
+      </w:r>
+    </w:p>
+    <w:p>
+      <w:pPr>
+        <w:ind w:firstLine="720"/>
+      </w:pPr>
+      <w:r>
+        <w:t>&lt;div class</w:t>
+      </w:r>
+      <w:proofErr w:type="gramStart"/>
+      <w:r>
+        <w:t>=”row</w:t>
+      </w:r>
+      <w:proofErr w:type="gramEnd"/>
+      <w:r>
+        <w:t>”&gt;</w:t>
+      </w:r>
+    </w:p>
+    <w:p>
+      <w:pPr>
+        <w:pStyle w:val="Heading1"/>
+      </w:pPr>
+      <w:r>
         <w:t>To Dos</w:t>
       </w:r>
     </w:p>
@@ -1589,15 +1790,7 @@
         </w:numPr>
       </w:pPr>
       <w:r>
-        <w:t xml:space="preserve">Control </w:t>
-      </w:r>
-      <w:proofErr w:type="spellStart"/>
-      <w:r>
-        <w:t>onclick</w:t>
-      </w:r>
-      <w:proofErr w:type="spellEnd"/>
-      <w:r>
-        <w:t xml:space="preserve">/change events can’t find the library instance.  </w:t>
+        <w:t xml:space="preserve">Control onclick/change events can’t find the library instance.  </w:t>
       </w:r>
     </w:p>
     <w:p>
@@ -1615,8 +1808,6 @@
       <w:r>
         <w:t>hash table</w:t>
       </w:r>
-      <w:bookmarkStart w:id="0" w:name="_GoBack"/>
-      <w:bookmarkEnd w:id="0"/>
       <w:r>
         <w:t xml:space="preserve"> stored in the windows scope.</w:t>
       </w:r>
@@ -1642,15 +1833,7 @@
       </w:r>
       <w:proofErr w:type="spellEnd"/>
       <w:r>
-        <w:t xml:space="preserve"> and using self (</w:t>
-      </w:r>
-      <w:proofErr w:type="spellStart"/>
-      <w:r>
-        <w:t>var</w:t>
-      </w:r>
-      <w:proofErr w:type="spellEnd"/>
-      <w:r>
-        <w:t xml:space="preserve"> self = this;)</w:t>
+        <w:t xml:space="preserve"> and using self (var self = this;)</w:t>
       </w:r>
     </w:p>
     <w:p>
@@ -1676,7 +1859,7 @@
 </file>
 
 <file path=word/numbering.xml><?xml version="1.0" encoding="utf-8"?>
-<w:numbering xmlns:wpc="http://schemas.microsoft.com/office/word/2010/wordprocessingCanvas" xmlns:cx="http://schemas.microsoft.com/office/drawing/2014/chartex" xmlns:cx1="http://schemas.microsoft.com/office/drawing/2015/9/8/chartex" xmlns:cx2="http://schemas.microsoft.com/office/drawing/2015/10/21/chartex" xmlns:cx3="http://schemas.microsoft.com/office/drawing/2016/5/9/chartex" xmlns:cx4="http://schemas.microsoft.com/office/drawing/2016/5/10/chartex" xmlns:cx5="http://schemas.microsoft.com/office/drawing/2016/5/11/chartex" xmlns:mc="http://schemas.openxmlformats.org/markup-compatibility/2006" xmlns:o="urn:schemas-microsoft-com:office:office" xmlns:r="http://schemas.openxmlformats.org/officeDocument/2006/relationships" xmlns:m="http://schemas.openxmlformats.org/officeDocument/2006/math" xmlns:v="urn:schemas-microsoft-com:vml" xmlns:wp14="http://schemas.microsoft.com/office/word/2010/wordprocessingDrawing" xmlns:wp="http://schemas.openxmlformats.org/drawingml/2006/wordprocessingDrawing" xmlns:w10="urn:schemas-microsoft-com:office:word" xmlns:w="http://schemas.openxmlformats.org/wordprocessingml/2006/main" xmlns:w14="http://schemas.microsoft.com/office/word/2010/wordml" xmlns:w15="http://schemas.microsoft.com/office/word/2012/wordml" xmlns:w16se="http://schemas.microsoft.com/office/word/2015/wordml/symex" xmlns:wpg="http://schemas.microsoft.com/office/word/2010/wordprocessingGroup" xmlns:wpi="http://schemas.microsoft.com/office/word/2010/wordprocessingInk" xmlns:wne="http://schemas.microsoft.com/office/word/2006/wordml" xmlns:wps="http://schemas.microsoft.com/office/word/2010/wordprocessingShape" mc:Ignorable="w14 w15 w16se wp14">
+<w:numbering xmlns:wpc="http://schemas.microsoft.com/office/word/2010/wordprocessingCanvas" xmlns:cx="http://schemas.microsoft.com/office/drawing/2014/chartex" xmlns:cx1="http://schemas.microsoft.com/office/drawing/2015/9/8/chartex" xmlns:cx2="http://schemas.microsoft.com/office/drawing/2015/10/21/chartex" xmlns:cx3="http://schemas.microsoft.com/office/drawing/2016/5/9/chartex" xmlns:cx4="http://schemas.microsoft.com/office/drawing/2016/5/10/chartex" xmlns:cx5="http://schemas.microsoft.com/office/drawing/2016/5/11/chartex" xmlns:cx6="http://schemas.microsoft.com/office/drawing/2016/5/12/chartex" xmlns:cx7="http://schemas.microsoft.com/office/drawing/2016/5/13/chartex" xmlns:cx8="http://schemas.microsoft.com/office/drawing/2016/5/14/chartex" xmlns:mc="http://schemas.openxmlformats.org/markup-compatibility/2006" xmlns:aink="http://schemas.microsoft.com/office/drawing/2016/ink" xmlns:am3d="http://schemas.microsoft.com/office/drawing/2017/model3d" xmlns:o="urn:schemas-microsoft-com:office:office" xmlns:r="http://schemas.openxmlformats.org/officeDocument/2006/relationships" xmlns:m="http://schemas.openxmlformats.org/officeDocument/2006/math" xmlns:v="urn:schemas-microsoft-com:vml" xmlns:wp14="http://schemas.microsoft.com/office/word/2010/wordprocessingDrawing" xmlns:wp="http://schemas.openxmlformats.org/drawingml/2006/wordprocessingDrawing" xmlns:w10="urn:schemas-microsoft-com:office:word" xmlns:w="http://schemas.openxmlformats.org/wordprocessingml/2006/main" xmlns:w14="http://schemas.microsoft.com/office/word/2010/wordml" xmlns:w15="http://schemas.microsoft.com/office/word/2012/wordml" xmlns:w16cid="http://schemas.microsoft.com/office/word/2016/wordml/cid" xmlns:w16se="http://schemas.microsoft.com/office/word/2015/wordml/symex" xmlns:wpg="http://schemas.microsoft.com/office/word/2010/wordprocessingGroup" xmlns:wpi="http://schemas.microsoft.com/office/word/2010/wordprocessingInk" xmlns:wne="http://schemas.microsoft.com/office/word/2006/wordml" xmlns:wps="http://schemas.microsoft.com/office/word/2010/wordprocessingShape" mc:Ignorable="w14 w15 w16se w16cid wp14">
   <w:abstractNum w:abstractNumId="0" w15:restartNumberingAfterBreak="0">
     <w:nsid w:val="0A6D3977"/>
     <w:multiLevelType w:val="hybridMultilevel"/>
@@ -2153,7 +2336,7 @@
 </file>
 
 <file path=word/styles.xml><?xml version="1.0" encoding="utf-8"?>
-<w:styles xmlns:mc="http://schemas.openxmlformats.org/markup-compatibility/2006" xmlns:r="http://schemas.openxmlformats.org/officeDocument/2006/relationships" xmlns:w="http://schemas.openxmlformats.org/wordprocessingml/2006/main" xmlns:w14="http://schemas.microsoft.com/office/word/2010/wordml" xmlns:w15="http://schemas.microsoft.com/office/word/2012/wordml" xmlns:w16se="http://schemas.microsoft.com/office/word/2015/wordml/symex" mc:Ignorable="w14 w15 w16se">
+<w:styles xmlns:mc="http://schemas.openxmlformats.org/markup-compatibility/2006" xmlns:r="http://schemas.openxmlformats.org/officeDocument/2006/relationships" xmlns:w="http://schemas.openxmlformats.org/wordprocessingml/2006/main" xmlns:w14="http://schemas.microsoft.com/office/word/2010/wordml" xmlns:w15="http://schemas.microsoft.com/office/word/2012/wordml" xmlns:w16cid="http://schemas.microsoft.com/office/word/2016/wordml/cid" xmlns:w16se="http://schemas.microsoft.com/office/word/2015/wordml/symex" mc:Ignorable="w14 w15 w16se w16cid">
   <w:docDefaults>
     <w:rPrDefault>
       <w:rPr>
@@ -2169,7 +2352,7 @@
       </w:pPr>
     </w:pPrDefault>
   </w:docDefaults>
-  <w:latentStyles w:defLockedState="0" w:defUIPriority="99" w:defSemiHidden="0" w:defUnhideWhenUsed="0" w:defQFormat="0" w:count="374">
+  <w:latentStyles w:defLockedState="0" w:defUIPriority="99" w:defSemiHidden="0" w:defUnhideWhenUsed="0" w:defQFormat="0" w:count="375">
     <w:lsdException w:name="Normal" w:uiPriority="0" w:qFormat="1"/>
     <w:lsdException w:name="heading 1" w:uiPriority="9" w:qFormat="1"/>
     <w:lsdException w:name="heading 2" w:semiHidden="1" w:uiPriority="9" w:unhideWhenUsed="1" w:qFormat="1"/>
@@ -2275,7 +2458,6 @@
     <w:lsdException w:name="HTML Sample" w:semiHidden="1" w:unhideWhenUsed="1"/>
     <w:lsdException w:name="HTML Typewriter" w:semiHidden="1" w:unhideWhenUsed="1"/>
     <w:lsdException w:name="HTML Variable" w:semiHidden="1" w:unhideWhenUsed="1"/>
-    <w:lsdException w:name="Normal Table" w:semiHidden="1" w:unhideWhenUsed="1"/>
     <w:lsdException w:name="annotation subject" w:semiHidden="1" w:unhideWhenUsed="1"/>
     <w:lsdException w:name="No List" w:semiHidden="1" w:unhideWhenUsed="1"/>
     <w:lsdException w:name="Outline List 1" w:semiHidden="1" w:unhideWhenUsed="1"/>
@@ -2322,10 +2504,8 @@
     <w:lsdException w:name="Table Subtle 2" w:semiHidden="1" w:unhideWhenUsed="1"/>
     <w:lsdException w:name="Table Web 1" w:semiHidden="1" w:unhideWhenUsed="1"/>
     <w:lsdException w:name="Table Web 2" w:semiHidden="1" w:unhideWhenUsed="1"/>
-    <w:lsdException w:name="Table Web 3" w:semiHidden="1" w:unhideWhenUsed="1"/>
     <w:lsdException w:name="Balloon Text" w:semiHidden="1" w:unhideWhenUsed="1"/>
     <w:lsdException w:name="Table Grid" w:uiPriority="39"/>
-    <w:lsdException w:name="Table Theme" w:semiHidden="1" w:unhideWhenUsed="1"/>
     <w:lsdException w:name="Placeholder Text" w:semiHidden="1"/>
     <w:lsdException w:name="No Spacing" w:uiPriority="1" w:qFormat="1"/>
     <w:lsdException w:name="Light Shading" w:uiPriority="60"/>
@@ -2544,6 +2724,7 @@
     <w:lsdException w:name="Mention" w:semiHidden="1" w:unhideWhenUsed="1"/>
     <w:lsdException w:name="Smart Hyperlink" w:semiHidden="1" w:unhideWhenUsed="1"/>
     <w:lsdException w:name="Hashtag" w:semiHidden="1" w:unhideWhenUsed="1"/>
+    <w:lsdException w:name="Unresolved Mention" w:semiHidden="1" w:unhideWhenUsed="1"/>
   </w:latentStyles>
   <w:style w:type="paragraph" w:default="1" w:styleId="Normal">
     <w:name w:val="Normal"/>

</xml_diff>

<commit_message>
Version 0.9.1: Filter feature complete
</commit_message>
<xml_diff>
--- a/TurboTables-DesignNotes.docx
+++ b/TurboTables-DesignNotes.docx
@@ -134,7 +134,13 @@
         <w:ind w:left="1080"/>
       </w:pPr>
       <w:r>
-        <w:t>Showing 1 – X of Y entries</w:t>
+        <w:t xml:space="preserve">Showing 1 </w:t>
+      </w:r>
+      <w:r>
+        <w:t>to</w:t>
+      </w:r>
+      <w:r>
+        <w:t xml:space="preserve"> X of Y entries</w:t>
       </w:r>
     </w:p>
     <w:p>
@@ -152,7 +158,19 @@
         <w:t xml:space="preserve"> client-side</w:t>
       </w:r>
       <w:r>
-        <w:t xml:space="preserve"> Filter, but only for data in the table (i.e. doesn’t pass filter to backend data server) </w:t>
+        <w:t xml:space="preserve"> </w:t>
+      </w:r>
+      <w:r>
+        <w:t>Searching</w:t>
+      </w:r>
+      <w:r>
+        <w:t xml:space="preserve">, but only for data in the table (i.e. doesn’t pass </w:t>
+      </w:r>
+      <w:r>
+        <w:t>search</w:t>
+      </w:r>
+      <w:r>
+        <w:t xml:space="preserve"> to backend data server) </w:t>
       </w:r>
     </w:p>
     <w:p>
@@ -224,7 +242,19 @@
         </w:numPr>
       </w:pPr>
       <w:r>
-        <w:t>Integrates seamlessly with Handlebars</w:t>
+        <w:t xml:space="preserve">Allows Header columns to be </w:t>
+      </w:r>
+      <w:r>
+        <w:t>fil</w:t>
+      </w:r>
+      <w:r>
+        <w:t>t</w:t>
+      </w:r>
+      <w:r>
+        <w:t>er</w:t>
+      </w:r>
+      <w:r>
+        <w:t>able</w:t>
       </w:r>
     </w:p>
     <w:p>
@@ -237,7 +267,10 @@
         <w:ind w:left="1080"/>
       </w:pPr>
       <w:r>
-        <w:t>Can populate data asynchronously via Handlebars template</w:t>
+        <w:t>Filter</w:t>
+      </w:r>
+      <w:r>
+        <w:t xml:space="preserve">ing done server-side </w:t>
       </w:r>
     </w:p>
     <w:p>
@@ -250,7 +283,10 @@
         <w:ind w:left="1080"/>
       </w:pPr>
       <w:r>
-        <w:t>Perhaps register the Handlebars template and update functions</w:t>
+        <w:t>Support for String data</w:t>
+      </w:r>
+      <w:r>
+        <w:t xml:space="preserve"> (future support for integer and datetime)</w:t>
       </w:r>
     </w:p>
     <w:p>
@@ -263,20 +299,19 @@
         <w:ind w:left="1080"/>
       </w:pPr>
       <w:r>
-        <w:t>Passes Page, Page Size, Sort Column, and Sort Direction to backend data server</w:t>
-      </w:r>
-    </w:p>
-    <w:p>
-      <w:pPr>
-        <w:pStyle w:val="ListParagraph"/>
-        <w:numPr>
-          <w:ilvl w:val="1"/>
-          <w:numId w:val="1"/>
-        </w:numPr>
-        <w:ind w:left="1080"/>
-      </w:pPr>
-      <w:r>
-        <w:t xml:space="preserve">Receives data plus total number of entries </w:t>
+        <w:t xml:space="preserve">Passes </w:t>
+      </w:r>
+      <w:r>
+        <w:t>filter column</w:t>
+      </w:r>
+      <w:r>
+        <w:t xml:space="preserve"> and </w:t>
+      </w:r>
+      <w:r>
+        <w:t xml:space="preserve">value </w:t>
+      </w:r>
+      <w:r>
+        <w:t xml:space="preserve">to server-side </w:t>
       </w:r>
     </w:p>
     <w:p>
@@ -288,7 +323,59 @@
         </w:numPr>
       </w:pPr>
       <w:r>
-        <w:t>Provides ‘spinner’ for displaying data loading asynchronously</w:t>
+        <w:t>Filtering</w:t>
+      </w:r>
+    </w:p>
+    <w:p>
+      <w:pPr>
+        <w:pStyle w:val="ListParagraph"/>
+        <w:numPr>
+          <w:ilvl w:val="1"/>
+          <w:numId w:val="1"/>
+        </w:numPr>
+        <w:ind w:left="1080"/>
+      </w:pPr>
+      <w:r>
+        <w:t>Use optionally by clicking on filter icon to open the filter controls</w:t>
+      </w:r>
+    </w:p>
+    <w:p>
+      <w:pPr>
+        <w:pStyle w:val="ListParagraph"/>
+        <w:numPr>
+          <w:ilvl w:val="1"/>
+          <w:numId w:val="1"/>
+        </w:numPr>
+        <w:ind w:left="1080"/>
+      </w:pPr>
+      <w:r>
+        <w:t>Ability to clear the filter</w:t>
+      </w:r>
+    </w:p>
+    <w:p>
+      <w:pPr>
+        <w:pStyle w:val="ListParagraph"/>
+        <w:numPr>
+          <w:ilvl w:val="1"/>
+          <w:numId w:val="1"/>
+        </w:numPr>
+        <w:ind w:left="1080"/>
+      </w:pPr>
+      <w:r>
+        <w:t>Submit filter via button</w:t>
+      </w:r>
+    </w:p>
+    <w:p>
+      <w:pPr>
+        <w:pStyle w:val="ListParagraph"/>
+        <w:numPr>
+          <w:ilvl w:val="1"/>
+          <w:numId w:val="1"/>
+        </w:numPr>
+        <w:ind w:left="1080"/>
+      </w:pPr>
+      <w:r>
+        <w:t>Hiding filter controls resets the filter column and value (i.e. ignore them)</w:t>
       </w:r>
     </w:p>
     <w:p>
@@ -300,7 +387,65 @@
         </w:numPr>
       </w:pPr>
       <w:r>
-        <w:t>Displays default message when there are no records to display</w:t>
+        <w:t>Integrates seamlessly with Handlebars</w:t>
+      </w:r>
+    </w:p>
+    <w:p>
+      <w:pPr>
+        <w:pStyle w:val="ListParagraph"/>
+        <w:numPr>
+          <w:ilvl w:val="1"/>
+          <w:numId w:val="1"/>
+        </w:numPr>
+        <w:ind w:left="1080"/>
+      </w:pPr>
+      <w:r>
+        <w:t>Can populate data asynchronously via Handlebars template</w:t>
+      </w:r>
+    </w:p>
+    <w:p>
+      <w:pPr>
+        <w:pStyle w:val="ListParagraph"/>
+        <w:numPr>
+          <w:ilvl w:val="1"/>
+          <w:numId w:val="1"/>
+        </w:numPr>
+        <w:ind w:left="1080"/>
+      </w:pPr>
+      <w:r>
+        <w:t>Perhaps register the Handlebars template and update functions</w:t>
+      </w:r>
+    </w:p>
+    <w:p>
+      <w:pPr>
+        <w:pStyle w:val="ListParagraph"/>
+        <w:numPr>
+          <w:ilvl w:val="1"/>
+          <w:numId w:val="1"/>
+        </w:numPr>
+        <w:ind w:left="1080"/>
+      </w:pPr>
+      <w:r>
+        <w:t>Passes Page, Page Size, Sort Column, Sort Direction</w:t>
+      </w:r>
+      <w:r>
+        <w:t>, Filter Column, and Filter Value</w:t>
+      </w:r>
+      <w:r>
+        <w:t xml:space="preserve"> to backend data server</w:t>
+      </w:r>
+    </w:p>
+    <w:p>
+      <w:pPr>
+        <w:pStyle w:val="ListParagraph"/>
+        <w:numPr>
+          <w:ilvl w:val="1"/>
+          <w:numId w:val="1"/>
+        </w:numPr>
+        <w:ind w:left="1080"/>
+      </w:pPr>
+      <w:r>
+        <w:t xml:space="preserve">Receives data plus total number of entries </w:t>
       </w:r>
     </w:p>
     <w:p>
@@ -312,7 +457,7 @@
         </w:numPr>
       </w:pPr>
       <w:r>
-        <w:t>Uses Bootstrap for styling</w:t>
+        <w:t>Provides ‘spinner’ for displaying data loading asynchronously</w:t>
       </w:r>
     </w:p>
     <w:p>
@@ -324,6 +469,36 @@
         </w:numPr>
       </w:pPr>
       <w:r>
+        <w:t>Displays default message when there are no records to display</w:t>
+      </w:r>
+    </w:p>
+    <w:p>
+      <w:pPr>
+        <w:pStyle w:val="ListParagraph"/>
+        <w:numPr>
+          <w:ilvl w:val="0"/>
+          <w:numId w:val="1"/>
+        </w:numPr>
+      </w:pPr>
+      <w:r>
+        <w:t xml:space="preserve">Uses Bootstrap </w:t>
+      </w:r>
+      <w:r>
+        <w:t xml:space="preserve">4 </w:t>
+      </w:r>
+      <w:r>
+        <w:t>for styling</w:t>
+      </w:r>
+    </w:p>
+    <w:p>
+      <w:pPr>
+        <w:pStyle w:val="ListParagraph"/>
+        <w:numPr>
+          <w:ilvl w:val="0"/>
+          <w:numId w:val="1"/>
+        </w:numPr>
+      </w:pPr>
+      <w:r>
         <w:t>Needs to be responsive:</w:t>
       </w:r>
     </w:p>
@@ -389,6 +564,9 @@
       <w:r>
         <w:t>Uses a minimum of jQuery</w:t>
       </w:r>
+      <w:r>
+        <w:t xml:space="preserve"> 3.3.1</w:t>
+      </w:r>
     </w:p>
     <w:p>
       <w:pPr>
@@ -431,6 +609,7 @@
         </w:numPr>
       </w:pPr>
       <w:r>
+        <w:lastRenderedPageBreak/>
         <w:t>Throw exception where appropriate</w:t>
       </w:r>
     </w:p>
@@ -531,7 +710,46 @@
         <w:ind w:left="1080"/>
       </w:pPr>
       <w:r>
+        <w:t>Filtering column</w:t>
+      </w:r>
+    </w:p>
+    <w:p>
+      <w:pPr>
+        <w:pStyle w:val="ListParagraph"/>
+        <w:numPr>
+          <w:ilvl w:val="1"/>
+          <w:numId w:val="2"/>
+        </w:numPr>
+        <w:ind w:left="1080"/>
+      </w:pPr>
+      <w:r>
+        <w:t>Filtering value</w:t>
+      </w:r>
+    </w:p>
+    <w:p>
+      <w:pPr>
+        <w:pStyle w:val="ListParagraph"/>
+        <w:numPr>
+          <w:ilvl w:val="1"/>
+          <w:numId w:val="2"/>
+        </w:numPr>
+        <w:ind w:left="1080"/>
+      </w:pPr>
+      <w:r>
         <w:t>Sortable column headers</w:t>
+      </w:r>
+    </w:p>
+    <w:p>
+      <w:pPr>
+        <w:pStyle w:val="ListParagraph"/>
+        <w:numPr>
+          <w:ilvl w:val="1"/>
+          <w:numId w:val="2"/>
+        </w:numPr>
+        <w:ind w:left="1080"/>
+      </w:pPr>
+      <w:r>
+        <w:t>Filterable column headers</w:t>
       </w:r>
     </w:p>
     <w:p>
@@ -556,7 +774,6 @@
         </w:numPr>
       </w:pPr>
       <w:r>
-        <w:lastRenderedPageBreak/>
         <w:t>Defaults:</w:t>
       </w:r>
     </w:p>
@@ -632,6 +849,40 @@
       <w:proofErr w:type="spellEnd"/>
       <w:r>
         <w:t>’</w:t>
+      </w:r>
+    </w:p>
+    <w:p>
+      <w:pPr>
+        <w:pStyle w:val="ListParagraph"/>
+        <w:numPr>
+          <w:ilvl w:val="1"/>
+          <w:numId w:val="2"/>
+        </w:numPr>
+      </w:pPr>
+      <w:proofErr w:type="spellStart"/>
+      <w:r>
+        <w:t>FilterColumn</w:t>
+      </w:r>
+      <w:proofErr w:type="spellEnd"/>
+      <w:r>
+        <w:t xml:space="preserve"> = ‘’</w:t>
+      </w:r>
+    </w:p>
+    <w:p>
+      <w:pPr>
+        <w:pStyle w:val="ListParagraph"/>
+        <w:numPr>
+          <w:ilvl w:val="1"/>
+          <w:numId w:val="2"/>
+        </w:numPr>
+      </w:pPr>
+      <w:proofErr w:type="spellStart"/>
+      <w:r>
+        <w:t>FilterValue</w:t>
+      </w:r>
+      <w:proofErr w:type="spellEnd"/>
+      <w:r>
+        <w:t xml:space="preserve"> = ‘’</w:t>
       </w:r>
     </w:p>
     <w:p>
@@ -848,10 +1099,24 @@
       </w:r>
       <w:proofErr w:type="spellEnd"/>
       <w:r>
-        <w:t xml:space="preserve"> id=”FirstName”</w:t>
-      </w:r>
-      <w:r>
-        <w:t xml:space="preserve"> class=”sortable”</w:t>
+        <w:t xml:space="preserve"> id</w:t>
+      </w:r>
+      <w:proofErr w:type="gramStart"/>
+      <w:r>
+        <w:t>=”FirstName</w:t>
+      </w:r>
+      <w:proofErr w:type="gramEnd"/>
+      <w:r>
+        <w:t>”</w:t>
+      </w:r>
+      <w:r>
+        <w:t xml:space="preserve"> class=”sortable</w:t>
+      </w:r>
+      <w:r>
+        <w:t xml:space="preserve"> filterable</w:t>
+      </w:r>
+      <w:r>
+        <w:t>”</w:t>
       </w:r>
       <w:r>
         <w:t>&gt;</w:t>
@@ -935,13 +1200,18 @@
       </w:r>
       <w:proofErr w:type="spellEnd"/>
       <w:r>
-        <w:t xml:space="preserve"> id=”</w:t>
+        <w:t xml:space="preserve"> id</w:t>
+      </w:r>
+      <w:proofErr w:type="gramStart"/>
+      <w:r>
+        <w:t>=”</w:t>
       </w:r>
       <w:proofErr w:type="spellStart"/>
       <w:r>
         <w:t>LastName</w:t>
       </w:r>
       <w:proofErr w:type="spellEnd"/>
+      <w:proofErr w:type="gramEnd"/>
       <w:r>
         <w:t>”</w:t>
       </w:r>
@@ -953,6 +1223,9 @@
         <w:t>sorable</w:t>
       </w:r>
       <w:proofErr w:type="spellEnd"/>
+      <w:r>
+        <w:t xml:space="preserve"> filterable</w:t>
+      </w:r>
       <w:r>
         <w:t>”</w:t>
       </w:r>
@@ -1047,10 +1320,24 @@
       </w:r>
       <w:proofErr w:type="spellEnd"/>
       <w:r>
-        <w:t xml:space="preserve"> id=”Email”</w:t>
-      </w:r>
-      <w:r>
-        <w:t xml:space="preserve"> class=”sortable”</w:t>
+        <w:t xml:space="preserve"> id</w:t>
+      </w:r>
+      <w:proofErr w:type="gramStart"/>
+      <w:r>
+        <w:t>=”Email</w:t>
+      </w:r>
+      <w:proofErr w:type="gramEnd"/>
+      <w:r>
+        <w:t>”</w:t>
+      </w:r>
+      <w:r>
+        <w:t xml:space="preserve"> class=”sortable</w:t>
+      </w:r>
+      <w:r>
+        <w:t xml:space="preserve"> filterable</w:t>
+      </w:r>
+      <w:r>
+        <w:t>”</w:t>
       </w:r>
       <w:r>
         <w:t>&gt;</w:t>
@@ -1288,6 +1575,7 @@
         <w:ind w:left="900"/>
       </w:pPr>
       <w:r>
+        <w:lastRenderedPageBreak/>
         <w:t>page: 1,</w:t>
       </w:r>
     </w:p>
@@ -1504,7 +1792,6 @@
         </w:numPr>
       </w:pPr>
       <w:r>
-        <w:lastRenderedPageBreak/>
         <w:t>Test</w:t>
       </w:r>
     </w:p>
@@ -1595,12 +1882,7 @@
         <w:ind w:left="720" w:firstLine="720"/>
       </w:pPr>
       <w:r>
-        <w:t>&lt;form clas</w:t>
-      </w:r>
-      <w:bookmarkStart w:id="0" w:name="_GoBack"/>
-      <w:bookmarkEnd w:id="0"/>
-      <w:r>
-        <w:t>s</w:t>
+        <w:t>&lt;form class</w:t>
       </w:r>
       <w:proofErr w:type="gramStart"/>
       <w:r>
@@ -1743,19 +2025,8 @@
         <w:pStyle w:val="Heading1"/>
       </w:pPr>
       <w:r>
+        <w:lastRenderedPageBreak/>
         <w:t>To Dos</w:t>
-      </w:r>
-    </w:p>
-    <w:p>
-      <w:pPr>
-        <w:pStyle w:val="ListParagraph"/>
-        <w:numPr>
-          <w:ilvl w:val="0"/>
-          <w:numId w:val="5"/>
-        </w:numPr>
-      </w:pPr>
-      <w:r>
-        <w:t>Columns should indicate whether they are sortable via a class ‘sortable’.</w:t>
       </w:r>
     </w:p>
     <w:p>
@@ -1844,6 +2115,8 @@
           <w:numId w:val="4"/>
         </w:numPr>
       </w:pPr>
+      <w:bookmarkStart w:id="0" w:name="_GoBack"/>
+      <w:bookmarkEnd w:id="0"/>
       <w:r>
         <w:t>Spinner needs to compute it’s top and left locations</w:t>
       </w:r>
@@ -2458,6 +2731,7 @@
     <w:lsdException w:name="HTML Sample" w:semiHidden="1" w:unhideWhenUsed="1"/>
     <w:lsdException w:name="HTML Typewriter" w:semiHidden="1" w:unhideWhenUsed="1"/>
     <w:lsdException w:name="HTML Variable" w:semiHidden="1" w:unhideWhenUsed="1"/>
+    <w:lsdException w:name="Normal Table" w:semiHidden="1" w:unhideWhenUsed="1"/>
     <w:lsdException w:name="annotation subject" w:semiHidden="1" w:unhideWhenUsed="1"/>
     <w:lsdException w:name="No List" w:semiHidden="1" w:unhideWhenUsed="1"/>
     <w:lsdException w:name="Outline List 1" w:semiHidden="1" w:unhideWhenUsed="1"/>
@@ -2504,8 +2778,10 @@
     <w:lsdException w:name="Table Subtle 2" w:semiHidden="1" w:unhideWhenUsed="1"/>
     <w:lsdException w:name="Table Web 1" w:semiHidden="1" w:unhideWhenUsed="1"/>
     <w:lsdException w:name="Table Web 2" w:semiHidden="1" w:unhideWhenUsed="1"/>
+    <w:lsdException w:name="Table Web 3" w:semiHidden="1" w:unhideWhenUsed="1"/>
     <w:lsdException w:name="Balloon Text" w:semiHidden="1" w:unhideWhenUsed="1"/>
     <w:lsdException w:name="Table Grid" w:uiPriority="39"/>
+    <w:lsdException w:name="Table Theme" w:semiHidden="1" w:unhideWhenUsed="1"/>
     <w:lsdException w:name="Placeholder Text" w:semiHidden="1"/>
     <w:lsdException w:name="No Spacing" w:uiPriority="1" w:qFormat="1"/>
     <w:lsdException w:name="Light Shading" w:uiPriority="60"/>

</xml_diff>

<commit_message>
Updated the Design Notes for latest changes.
</commit_message>
<xml_diff>
--- a/TurboTables-DesignNotes.docx
+++ b/TurboTables-DesignNotes.docx
@@ -4,15 +4,7 @@
   <w:body>
     <w:p>
       <w:r>
-        <w:t xml:space="preserve">A </w:t>
-      </w:r>
-      <w:proofErr w:type="spellStart"/>
-      <w:r>
-        <w:t>javaScript</w:t>
-      </w:r>
-      <w:proofErr w:type="spellEnd"/>
-      <w:r>
-        <w:t xml:space="preserve"> library which supports an HTML 5 Data Table with paging, using Handlebars.js and Bootstrap. </w:t>
+        <w:t xml:space="preserve">A javaScript library which supports an HTML 5 Data Table with paging, using Handlebars.js and Bootstrap. </w:t>
       </w:r>
     </w:p>
     <w:p>
@@ -242,76 +234,46 @@
         </w:numPr>
       </w:pPr>
       <w:r>
-        <w:t xml:space="preserve">Allows Header columns to be </w:t>
-      </w:r>
-      <w:r>
-        <w:t>fil</w:t>
-      </w:r>
-      <w:r>
-        <w:t>t</w:t>
-      </w:r>
-      <w:r>
-        <w:t>er</w:t>
-      </w:r>
-      <w:r>
-        <w:t>able</w:t>
-      </w:r>
-    </w:p>
-    <w:p>
-      <w:pPr>
-        <w:pStyle w:val="ListParagraph"/>
-        <w:numPr>
-          <w:ilvl w:val="1"/>
-          <w:numId w:val="1"/>
-        </w:numPr>
-        <w:ind w:left="1080"/>
-      </w:pPr>
-      <w:r>
-        <w:t>Filter</w:t>
-      </w:r>
-      <w:r>
-        <w:t xml:space="preserve">ing done server-side </w:t>
-      </w:r>
-    </w:p>
-    <w:p>
-      <w:pPr>
-        <w:pStyle w:val="ListParagraph"/>
-        <w:numPr>
-          <w:ilvl w:val="1"/>
-          <w:numId w:val="1"/>
-        </w:numPr>
-        <w:ind w:left="1080"/>
-      </w:pPr>
-      <w:r>
-        <w:t>Support for String data</w:t>
-      </w:r>
-      <w:r>
-        <w:t xml:space="preserve"> (future support for integer and datetime)</w:t>
-      </w:r>
-    </w:p>
-    <w:p>
-      <w:pPr>
-        <w:pStyle w:val="ListParagraph"/>
-        <w:numPr>
-          <w:ilvl w:val="1"/>
-          <w:numId w:val="1"/>
-        </w:numPr>
-        <w:ind w:left="1080"/>
-      </w:pPr>
-      <w:r>
-        <w:t xml:space="preserve">Passes </w:t>
-      </w:r>
-      <w:r>
-        <w:t>filter column</w:t>
-      </w:r>
-      <w:r>
-        <w:t xml:space="preserve"> and </w:t>
-      </w:r>
-      <w:r>
-        <w:t xml:space="preserve">value </w:t>
-      </w:r>
-      <w:r>
-        <w:t xml:space="preserve">to server-side </w:t>
+        <w:t>Allows Header columns to be filterable</w:t>
+      </w:r>
+    </w:p>
+    <w:p>
+      <w:pPr>
+        <w:pStyle w:val="ListParagraph"/>
+        <w:numPr>
+          <w:ilvl w:val="1"/>
+          <w:numId w:val="1"/>
+        </w:numPr>
+        <w:ind w:left="1080"/>
+      </w:pPr>
+      <w:r>
+        <w:t xml:space="preserve">Filtering done server-side </w:t>
+      </w:r>
+    </w:p>
+    <w:p>
+      <w:pPr>
+        <w:pStyle w:val="ListParagraph"/>
+        <w:numPr>
+          <w:ilvl w:val="1"/>
+          <w:numId w:val="1"/>
+        </w:numPr>
+        <w:ind w:left="1080"/>
+      </w:pPr>
+      <w:r>
+        <w:t>Support for String data (future support for integer and datetime)</w:t>
+      </w:r>
+    </w:p>
+    <w:p>
+      <w:pPr>
+        <w:pStyle w:val="ListParagraph"/>
+        <w:numPr>
+          <w:ilvl w:val="1"/>
+          <w:numId w:val="1"/>
+        </w:numPr>
+        <w:ind w:left="1080"/>
+      </w:pPr>
+      <w:r>
+        <w:t xml:space="preserve">Passes filter column and value to server-side </w:t>
       </w:r>
     </w:p>
     <w:p>
@@ -376,6 +338,30 @@
       </w:pPr>
       <w:r>
         <w:t>Hiding filter controls resets the filter column and value (i.e. ignore them)</w:t>
+      </w:r>
+    </w:p>
+    <w:p>
+      <w:pPr>
+        <w:pStyle w:val="ListParagraph"/>
+        <w:numPr>
+          <w:ilvl w:val="1"/>
+          <w:numId w:val="1"/>
+        </w:numPr>
+        <w:ind w:left="1080"/>
+      </w:pPr>
+      <w:r>
+        <w:t xml:space="preserve">Provide a flag </w:t>
+      </w:r>
+      <w:r>
+        <w:t>(showFilter)</w:t>
+      </w:r>
+      <w:r>
+        <w:t xml:space="preserve"> </w:t>
+      </w:r>
+      <w:bookmarkStart w:id="0" w:name="_GoBack"/>
+      <w:bookmarkEnd w:id="0"/>
+      <w:r>
+        <w:t>for enabling / disabling the filtering functionality</w:t>
       </w:r>
     </w:p>
     <w:p>
@@ -545,13 +531,8 @@
         </w:numPr>
       </w:pPr>
       <w:r>
-        <w:t xml:space="preserve">Written in </w:t>
-      </w:r>
-      <w:proofErr w:type="spellStart"/>
-      <w:r>
-        <w:t>javaScript</w:t>
-      </w:r>
-      <w:proofErr w:type="spellEnd"/>
+        <w:t>Written in javaScript</w:t>
+      </w:r>
     </w:p>
     <w:p>
       <w:pPr>
@@ -577,15 +558,7 @@
         </w:numPr>
       </w:pPr>
       <w:r>
-        <w:t xml:space="preserve">Use </w:t>
-      </w:r>
-      <w:proofErr w:type="spellStart"/>
-      <w:r>
-        <w:t>javaScript</w:t>
-      </w:r>
-      <w:proofErr w:type="spellEnd"/>
-      <w:r>
-        <w:t xml:space="preserve"> prototypes (why?)</w:t>
+        <w:t>Use javaScript prototypes (why?)</w:t>
       </w:r>
     </w:p>
     <w:p>
@@ -597,6 +570,7 @@
         </w:numPr>
       </w:pPr>
       <w:r>
+        <w:lastRenderedPageBreak/>
         <w:t>Try to hide the private helper functions</w:t>
       </w:r>
     </w:p>
@@ -609,7 +583,6 @@
         </w:numPr>
       </w:pPr>
       <w:r>
-        <w:lastRenderedPageBreak/>
         <w:t>Throw exception where appropriate</w:t>
       </w:r>
     </w:p>
@@ -797,13 +770,8 @@
           <w:numId w:val="2"/>
         </w:numPr>
       </w:pPr>
-      <w:proofErr w:type="spellStart"/>
-      <w:r>
-        <w:t>PageSize</w:t>
-      </w:r>
-      <w:proofErr w:type="spellEnd"/>
-      <w:r>
-        <w:t>: 10</w:t>
+      <w:r>
+        <w:t>PageSize: 10</w:t>
       </w:r>
     </w:p>
     <w:p>
@@ -814,14 +782,12 @@
           <w:numId w:val="2"/>
         </w:numPr>
       </w:pPr>
-      <w:proofErr w:type="spellStart"/>
       <w:r>
         <w:t>Sort</w:t>
       </w:r>
       <w:r>
         <w:t>Column</w:t>
       </w:r>
-      <w:proofErr w:type="spellEnd"/>
       <w:r>
         <w:t>: Id</w:t>
       </w:r>
@@ -834,21 +800,8 @@
           <w:numId w:val="2"/>
         </w:numPr>
       </w:pPr>
-      <w:proofErr w:type="spellStart"/>
-      <w:r>
-        <w:t>SortDirection</w:t>
-      </w:r>
-      <w:proofErr w:type="spellEnd"/>
-      <w:r>
-        <w:t>: ‘</w:t>
-      </w:r>
-      <w:proofErr w:type="spellStart"/>
-      <w:r>
-        <w:t>asc</w:t>
-      </w:r>
-      <w:proofErr w:type="spellEnd"/>
-      <w:r>
-        <w:t>’</w:t>
+      <w:r>
+        <w:t>SortDirection: ‘asc’</w:t>
       </w:r>
     </w:p>
     <w:p>
@@ -859,13 +812,8 @@
           <w:numId w:val="2"/>
         </w:numPr>
       </w:pPr>
-      <w:proofErr w:type="spellStart"/>
-      <w:r>
-        <w:t>FilterColumn</w:t>
-      </w:r>
-      <w:proofErr w:type="spellEnd"/>
-      <w:r>
-        <w:t xml:space="preserve"> = ‘’</w:t>
+      <w:r>
+        <w:t>FilterColumn = ‘’</w:t>
       </w:r>
     </w:p>
     <w:p>
@@ -876,13 +824,20 @@
           <w:numId w:val="2"/>
         </w:numPr>
       </w:pPr>
-      <w:proofErr w:type="spellStart"/>
-      <w:r>
-        <w:t>FilterValue</w:t>
-      </w:r>
-      <w:proofErr w:type="spellEnd"/>
-      <w:r>
-        <w:t xml:space="preserve"> = ‘’</w:t>
+      <w:r>
+        <w:t>FilterValue = ‘’</w:t>
+      </w:r>
+    </w:p>
+    <w:p>
+      <w:pPr>
+        <w:pStyle w:val="ListParagraph"/>
+        <w:numPr>
+          <w:ilvl w:val="1"/>
+          <w:numId w:val="2"/>
+        </w:numPr>
+      </w:pPr>
+      <w:r>
+        <w:t>showFilter = false</w:t>
       </w:r>
     </w:p>
     <w:p>
@@ -924,26 +879,10 @@
         <w:ind w:left="720"/>
       </w:pPr>
       <w:r>
-        <w:t>&lt;table id=”</w:t>
-      </w:r>
-      <w:proofErr w:type="spellStart"/>
-      <w:r>
-        <w:t>CustomerTable</w:t>
-      </w:r>
-      <w:proofErr w:type="spellEnd"/>
-      <w:r>
-        <w:t>”</w:t>
-      </w:r>
-      <w:r>
-        <w:t xml:space="preserve"> </w:t>
-      </w:r>
-      <w:proofErr w:type="spellStart"/>
-      <w:r>
-        <w:t>ctTotalItems</w:t>
-      </w:r>
-      <w:proofErr w:type="spellEnd"/>
-      <w:r>
-        <w:t>=”100”</w:t>
+        <w:t>&lt;table id=”CustomerTable”</w:t>
+      </w:r>
+      <w:r>
+        <w:t xml:space="preserve"> ctTotalItems=”100”</w:t>
       </w:r>
       <w:r>
         <w:t xml:space="preserve"> class=”table table-striped tabled-bordered </w:t>
@@ -961,32 +900,16 @@
         <w:ind w:left="900"/>
       </w:pPr>
       <w:r>
-        <w:t>&lt;</w:t>
-      </w:r>
-      <w:proofErr w:type="spellStart"/>
-      <w:r>
-        <w:t>thead</w:t>
-      </w:r>
-      <w:proofErr w:type="spellEnd"/>
-      <w:r>
-        <w:t>&gt;</w:t>
-      </w:r>
-    </w:p>
-    <w:p>
-      <w:pPr>
-        <w:spacing w:after="0"/>
-        <w:ind w:left="1080"/>
-      </w:pPr>
-      <w:r>
-        <w:t>&lt;tr class=”</w:t>
-      </w:r>
-      <w:proofErr w:type="spellStart"/>
-      <w:r>
-        <w:t>colHeaders</w:t>
-      </w:r>
-      <w:proofErr w:type="spellEnd"/>
-      <w:r>
-        <w:t>”&gt;</w:t>
+        <w:t>&lt;thead&gt;</w:t>
+      </w:r>
+    </w:p>
+    <w:p>
+      <w:pPr>
+        <w:spacing w:after="0"/>
+        <w:ind w:left="1080"/>
+      </w:pPr>
+      <w:r>
+        <w:t>&lt;tr class=”colHeaders”&gt;</w:t>
       </w:r>
     </w:p>
     <w:p>
@@ -995,13 +918,8 @@
         <w:ind w:left="1260"/>
       </w:pPr>
       <w:r>
-        <w:t>&lt;</w:t>
-      </w:r>
-      <w:proofErr w:type="spellStart"/>
-      <w:r>
-        <w:t>th</w:t>
-      </w:r>
-      <w:proofErr w:type="spellEnd"/>
+        <w:t>&lt;th</w:t>
+      </w:r>
       <w:r>
         <w:t xml:space="preserve"> id=”Id”</w:t>
       </w:r>
@@ -1047,7 +965,6 @@
         </w:rPr>
         <w:t xml:space="preserve"> </w:t>
       </w:r>
-      <w:proofErr w:type="spellStart"/>
       <w:r>
         <w:rPr>
           <w:rFonts w:ascii="Consolas" w:hAnsi="Consolas" w:cs="Consolas"/>
@@ -1057,7 +974,6 @@
         </w:rPr>
         <w:t>href</w:t>
       </w:r>
-      <w:proofErr w:type="spellEnd"/>
       <w:r>
         <w:rPr>
           <w:rFonts w:ascii="Consolas" w:hAnsi="Consolas" w:cs="Consolas"/>
@@ -1074,15 +990,7 @@
         <w:t>&lt;/a&gt;</w:t>
       </w:r>
       <w:r>
-        <w:t>&lt;/</w:t>
-      </w:r>
-      <w:proofErr w:type="spellStart"/>
-      <w:r>
-        <w:t>th</w:t>
-      </w:r>
-      <w:proofErr w:type="spellEnd"/>
-      <w:r>
-        <w:t>&gt;</w:t>
+        <w:t>&lt;/th&gt;</w:t>
       </w:r>
     </w:p>
     <w:p>
@@ -1091,23 +999,10 @@
         <w:ind w:left="1260"/>
       </w:pPr>
       <w:r>
-        <w:t>&lt;</w:t>
-      </w:r>
-      <w:proofErr w:type="spellStart"/>
-      <w:r>
-        <w:t>th</w:t>
-      </w:r>
-      <w:proofErr w:type="spellEnd"/>
-      <w:r>
-        <w:t xml:space="preserve"> id</w:t>
-      </w:r>
-      <w:proofErr w:type="gramStart"/>
-      <w:r>
-        <w:t>=”FirstName</w:t>
-      </w:r>
-      <w:proofErr w:type="gramEnd"/>
-      <w:r>
-        <w:t>”</w:t>
+        <w:t>&lt;th</w:t>
+      </w:r>
+      <w:r>
+        <w:t xml:space="preserve"> id=”FirstName”</w:t>
       </w:r>
       <w:r>
         <w:t xml:space="preserve"> class=”sortable</w:t>
@@ -1148,7 +1043,6 @@
         </w:rPr>
         <w:t xml:space="preserve"> </w:t>
       </w:r>
-      <w:proofErr w:type="spellStart"/>
       <w:r>
         <w:rPr>
           <w:rFonts w:ascii="Consolas" w:hAnsi="Consolas" w:cs="Consolas"/>
@@ -1158,7 +1052,6 @@
         </w:rPr>
         <w:t>href</w:t>
       </w:r>
-      <w:proofErr w:type="spellEnd"/>
       <w:r>
         <w:rPr>
           <w:rFonts w:ascii="Consolas" w:hAnsi="Consolas" w:cs="Consolas"/>
@@ -1175,15 +1068,7 @@
         <w:t>&lt;/a&gt;</w:t>
       </w:r>
       <w:r>
-        <w:t>&lt;/</w:t>
-      </w:r>
-      <w:proofErr w:type="spellStart"/>
-      <w:r>
-        <w:t>th</w:t>
-      </w:r>
-      <w:proofErr w:type="spellEnd"/>
-      <w:r>
-        <w:t>&gt;</w:t>
+        <w:t>&lt;/th&gt;</w:t>
       </w:r>
     </w:p>
     <w:p>
@@ -1192,37 +1077,14 @@
         <w:ind w:left="1260"/>
       </w:pPr>
       <w:r>
-        <w:t>&lt;</w:t>
-      </w:r>
-      <w:proofErr w:type="spellStart"/>
-      <w:r>
-        <w:t>th</w:t>
-      </w:r>
-      <w:proofErr w:type="spellEnd"/>
-      <w:r>
-        <w:t xml:space="preserve"> id</w:t>
-      </w:r>
-      <w:proofErr w:type="gramStart"/>
-      <w:r>
-        <w:t>=”</w:t>
-      </w:r>
-      <w:proofErr w:type="spellStart"/>
-      <w:r>
-        <w:t>LastName</w:t>
-      </w:r>
-      <w:proofErr w:type="spellEnd"/>
-      <w:proofErr w:type="gramEnd"/>
-      <w:r>
-        <w:t>”</w:t>
-      </w:r>
-      <w:r>
-        <w:t xml:space="preserve"> class=”</w:t>
-      </w:r>
-      <w:proofErr w:type="spellStart"/>
-      <w:r>
-        <w:t>sorable</w:t>
-      </w:r>
-      <w:proofErr w:type="spellEnd"/>
+        <w:t>&lt;th</w:t>
+      </w:r>
+      <w:r>
+        <w:t xml:space="preserve"> id=”LastName”</w:t>
+      </w:r>
+      <w:r>
+        <w:t xml:space="preserve"> class=”sorable</w:t>
+      </w:r>
       <w:r>
         <w:t xml:space="preserve"> filterable</w:t>
       </w:r>
@@ -1268,7 +1130,6 @@
         </w:rPr>
         <w:t xml:space="preserve"> </w:t>
       </w:r>
-      <w:proofErr w:type="spellStart"/>
       <w:r>
         <w:rPr>
           <w:rFonts w:ascii="Consolas" w:hAnsi="Consolas" w:cs="Consolas"/>
@@ -1278,7 +1139,6 @@
         </w:rPr>
         <w:t>href</w:t>
       </w:r>
-      <w:proofErr w:type="spellEnd"/>
       <w:r>
         <w:rPr>
           <w:rFonts w:ascii="Consolas" w:hAnsi="Consolas" w:cs="Consolas"/>
@@ -1295,15 +1155,7 @@
         <w:t>&lt;/a&gt;</w:t>
       </w:r>
       <w:r>
-        <w:t>&lt;/</w:t>
-      </w:r>
-      <w:proofErr w:type="spellStart"/>
-      <w:r>
-        <w:t>th</w:t>
-      </w:r>
-      <w:proofErr w:type="spellEnd"/>
-      <w:r>
-        <w:t>&gt;</w:t>
+        <w:t>&lt;/th&gt;</w:t>
       </w:r>
     </w:p>
     <w:p>
@@ -1312,23 +1164,10 @@
         <w:ind w:left="1260"/>
       </w:pPr>
       <w:r>
-        <w:t>&lt;</w:t>
-      </w:r>
-      <w:proofErr w:type="spellStart"/>
-      <w:r>
-        <w:t>th</w:t>
-      </w:r>
-      <w:proofErr w:type="spellEnd"/>
-      <w:r>
-        <w:t xml:space="preserve"> id</w:t>
-      </w:r>
-      <w:proofErr w:type="gramStart"/>
-      <w:r>
-        <w:t>=”Email</w:t>
-      </w:r>
-      <w:proofErr w:type="gramEnd"/>
-      <w:r>
-        <w:t>”</w:t>
+        <w:t>&lt;th</w:t>
+      </w:r>
+      <w:r>
+        <w:t xml:space="preserve"> id=”Email”</w:t>
       </w:r>
       <w:r>
         <w:t xml:space="preserve"> class=”sortable</w:t>
@@ -1369,7 +1208,6 @@
         </w:rPr>
         <w:t xml:space="preserve"> </w:t>
       </w:r>
-      <w:proofErr w:type="spellStart"/>
       <w:r>
         <w:rPr>
           <w:rFonts w:ascii="Consolas" w:hAnsi="Consolas" w:cs="Consolas"/>
@@ -1379,7 +1217,6 @@
         </w:rPr>
         <w:t>href</w:t>
       </w:r>
-      <w:proofErr w:type="spellEnd"/>
       <w:r>
         <w:rPr>
           <w:rFonts w:ascii="Consolas" w:hAnsi="Consolas" w:cs="Consolas"/>
@@ -1396,15 +1233,7 @@
         <w:t>&lt;/a&gt;</w:t>
       </w:r>
       <w:r>
-        <w:t>&lt;/</w:t>
-      </w:r>
-      <w:proofErr w:type="spellStart"/>
-      <w:r>
-        <w:t>th</w:t>
-      </w:r>
-      <w:proofErr w:type="spellEnd"/>
-      <w:r>
-        <w:t>&gt;</w:t>
+        <w:t>&lt;/th&gt;</w:t>
       </w:r>
     </w:p>
     <w:p>
@@ -1422,15 +1251,7 @@
         <w:ind w:left="900"/>
       </w:pPr>
       <w:r>
-        <w:t>&lt;/</w:t>
-      </w:r>
-      <w:proofErr w:type="spellStart"/>
-      <w:r>
-        <w:t>thead</w:t>
-      </w:r>
-      <w:proofErr w:type="spellEnd"/>
-      <w:r>
-        <w:t>&gt;</w:t>
+        <w:t>&lt;/thead&gt;</w:t>
       </w:r>
     </w:p>
     <w:p>
@@ -1439,23 +1260,7 @@
         <w:ind w:left="900"/>
       </w:pPr>
       <w:r>
-        <w:t>&lt;</w:t>
-      </w:r>
-      <w:proofErr w:type="spellStart"/>
-      <w:r>
-        <w:t>tbody</w:t>
-      </w:r>
-      <w:proofErr w:type="spellEnd"/>
-      <w:r>
-        <w:t xml:space="preserve"> id=”</w:t>
-      </w:r>
-      <w:proofErr w:type="spellStart"/>
-      <w:r>
-        <w:t>CustomerList</w:t>
-      </w:r>
-      <w:proofErr w:type="spellEnd"/>
-      <w:r>
-        <w:t>”&gt;</w:t>
+        <w:t>&lt;tbody id=”CustomerList”&gt;</w:t>
       </w:r>
     </w:p>
     <w:p>
@@ -1464,15 +1269,7 @@
         <w:ind w:left="900"/>
       </w:pPr>
       <w:r>
-        <w:t>&lt;/</w:t>
-      </w:r>
-      <w:proofErr w:type="spellStart"/>
-      <w:r>
-        <w:t>tbody</w:t>
-      </w:r>
-      <w:proofErr w:type="spellEnd"/>
-      <w:r>
-        <w:t>&gt;</w:t>
+        <w:t>&lt;/tbody&gt;</w:t>
       </w:r>
     </w:p>
     <w:p>
@@ -1510,16 +1307,11 @@
       <w:r>
         <w:t xml:space="preserve">var pager = new </w:t>
       </w:r>
-      <w:proofErr w:type="spellStart"/>
       <w:r>
         <w:t>Table</w:t>
       </w:r>
       <w:r>
-        <w:t>PagerLib</w:t>
-      </w:r>
-      <w:proofErr w:type="spellEnd"/>
-      <w:r>
-        <w:t>( {</w:t>
+        <w:t>PagerLib( {</w:t>
       </w:r>
     </w:p>
     <w:p>
@@ -1527,21 +1319,9 @@
         <w:spacing w:after="0"/>
         <w:ind w:left="900"/>
       </w:pPr>
-      <w:proofErr w:type="spellStart"/>
-      <w:r>
-        <w:t>tableId</w:t>
-      </w:r>
-      <w:proofErr w:type="spellEnd"/>
-      <w:r>
-        <w:t>: ‘</w:t>
-      </w:r>
-      <w:proofErr w:type="spellStart"/>
-      <w:r>
-        <w:t>CustomerTable</w:t>
-      </w:r>
-      <w:proofErr w:type="spellEnd"/>
-      <w:r>
-        <w:t>’</w:t>
+      <w:r>
+        <w:lastRenderedPageBreak/>
+        <w:t>tableId: ‘CustomerTable’</w:t>
       </w:r>
       <w:r>
         <w:t>,</w:t>
@@ -1552,21 +1332,8 @@
         <w:spacing w:after="0"/>
         <w:ind w:left="900"/>
       </w:pPr>
-      <w:proofErr w:type="spellStart"/>
-      <w:r>
-        <w:t>totalItemsAttribute</w:t>
-      </w:r>
-      <w:proofErr w:type="spellEnd"/>
-      <w:r>
-        <w:t>: ‘</w:t>
-      </w:r>
-      <w:proofErr w:type="spellStart"/>
-      <w:r>
-        <w:t>ctTotalItems</w:t>
-      </w:r>
-      <w:proofErr w:type="spellEnd"/>
-      <w:r>
-        <w:t>’,</w:t>
+      <w:r>
+        <w:t>totalItemsAttribute: ‘ctTotalItems’,</w:t>
       </w:r>
     </w:p>
     <w:p>
@@ -1575,7 +1342,6 @@
         <w:ind w:left="900"/>
       </w:pPr>
       <w:r>
-        <w:lastRenderedPageBreak/>
         <w:t>page: 1,</w:t>
       </w:r>
     </w:p>
@@ -1584,13 +1350,8 @@
         <w:spacing w:after="0"/>
         <w:ind w:left="900"/>
       </w:pPr>
-      <w:proofErr w:type="spellStart"/>
-      <w:r>
-        <w:t>pageSize</w:t>
-      </w:r>
-      <w:proofErr w:type="spellEnd"/>
-      <w:r>
-        <w:t>: 10,</w:t>
+      <w:r>
+        <w:t>pageSize: 10,</w:t>
       </w:r>
       <w:r>
         <w:t xml:space="preserve">   </w:t>
@@ -1601,13 +1362,8 @@
         <w:spacing w:after="0"/>
         <w:ind w:left="900"/>
       </w:pPr>
-      <w:proofErr w:type="spellStart"/>
-      <w:r>
-        <w:t>pageSizeOptions</w:t>
-      </w:r>
-      <w:proofErr w:type="spellEnd"/>
-      <w:r>
-        <w:t xml:space="preserve">: </w:t>
+      <w:r>
+        <w:t xml:space="preserve">pageSizeOptions: </w:t>
       </w:r>
       <w:r>
         <w:t>[</w:t>
@@ -1627,13 +1383,8 @@
         <w:spacing w:after="0"/>
         <w:ind w:left="900"/>
       </w:pPr>
-      <w:proofErr w:type="spellStart"/>
-      <w:r>
-        <w:t>sortColumn</w:t>
-      </w:r>
-      <w:proofErr w:type="spellEnd"/>
-      <w:r>
-        <w:t>: ‘Id’,</w:t>
+      <w:r>
+        <w:t>sortColumn: ‘Id’,</w:t>
       </w:r>
     </w:p>
     <w:p>
@@ -1641,21 +1392,8 @@
         <w:spacing w:after="0"/>
         <w:ind w:left="900"/>
       </w:pPr>
-      <w:proofErr w:type="spellStart"/>
-      <w:r>
-        <w:t>sortDirection</w:t>
-      </w:r>
-      <w:proofErr w:type="spellEnd"/>
-      <w:r>
-        <w:t>: ‘</w:t>
-      </w:r>
-      <w:proofErr w:type="spellStart"/>
-      <w:r>
-        <w:t>asc</w:t>
-      </w:r>
-      <w:proofErr w:type="spellEnd"/>
-      <w:r>
-        <w:t>’</w:t>
+      <w:r>
+        <w:t>sortDirection: ‘asc’</w:t>
       </w:r>
       <w:r>
         <w:t>,</w:t>
@@ -1666,21 +1404,17 @@
         <w:spacing w:after="0"/>
         <w:ind w:left="900"/>
       </w:pPr>
-      <w:proofErr w:type="spellStart"/>
-      <w:r>
-        <w:t>columnHeaderClass</w:t>
-      </w:r>
-      <w:proofErr w:type="spellEnd"/>
-      <w:r>
-        <w:t>: ‘</w:t>
-      </w:r>
-      <w:proofErr w:type="spellStart"/>
-      <w:r>
-        <w:t>colHeaders</w:t>
-      </w:r>
-      <w:proofErr w:type="spellEnd"/>
-      <w:r>
-        <w:t>’</w:t>
+      <w:r>
+        <w:t>showFilter: true,</w:t>
+      </w:r>
+    </w:p>
+    <w:p>
+      <w:pPr>
+        <w:spacing w:after="0"/>
+        <w:ind w:left="900"/>
+      </w:pPr>
+      <w:r>
+        <w:t>columnHeaderClass: ‘colHeaders’</w:t>
       </w:r>
       <w:r>
         <w:t>,</w:t>
@@ -1691,11 +1425,9 @@
         <w:spacing w:after="0"/>
         <w:ind w:left="900"/>
       </w:pPr>
-      <w:proofErr w:type="spellStart"/>
       <w:r>
         <w:t>spinnerRef</w:t>
       </w:r>
-      <w:proofErr w:type="spellEnd"/>
       <w:r>
         <w:t>: ‘/images/spinner-128.gif’</w:t>
       </w:r>
@@ -1725,7 +1457,6 @@
       <w:pPr>
         <w:ind w:left="720"/>
       </w:pPr>
-      <w:proofErr w:type="spellStart"/>
       <w:r>
         <w:t>pager.s</w:t>
       </w:r>
@@ -1733,11 +1464,7 @@
         <w:t>etData</w:t>
       </w:r>
       <w:r>
-        <w:t>Binding</w:t>
-      </w:r>
-      <w:proofErr w:type="spellEnd"/>
-      <w:r>
-        <w:t xml:space="preserve">( </w:t>
+        <w:t xml:space="preserve">Binding( </w:t>
       </w:r>
       <w:r>
         <w:t>function() {</w:t>
@@ -1756,21 +1483,11 @@
         <w:ind w:left="720"/>
       </w:pPr>
       <w:r>
-        <w:t xml:space="preserve">    </w:t>
-      </w:r>
-      <w:proofErr w:type="spellStart"/>
-      <w:r>
-        <w:t>pager.endDataBinding</w:t>
-      </w:r>
-      <w:proofErr w:type="spellEnd"/>
-      <w:r>
-        <w:t>(</w:t>
-      </w:r>
-      <w:proofErr w:type="spellStart"/>
+        <w:t xml:space="preserve">    pager.endDataBinding(</w:t>
+      </w:r>
       <w:r>
         <w:t>results.totalItems</w:t>
       </w:r>
-      <w:proofErr w:type="spellEnd"/>
       <w:r>
         <w:t>);</w:t>
       </w:r>
@@ -1809,15 +1526,7 @@
       </w:pPr>
       <w:r>
         <w:tab/>
-        <w:t>&lt;div class</w:t>
-      </w:r>
-      <w:proofErr w:type="gramStart"/>
-      <w:r>
-        <w:t>=”row</w:t>
-      </w:r>
-      <w:proofErr w:type="gramEnd"/>
-      <w:r>
-        <w:t>”&gt;</w:t>
+        <w:t>&lt;div class=”row”&gt;</w:t>
       </w:r>
     </w:p>
     <w:p>
@@ -1829,15 +1538,7 @@
       </w:r>
       <w:r>
         <w:tab/>
-        <w:t>&lt;div class</w:t>
-      </w:r>
-      <w:proofErr w:type="gramStart"/>
-      <w:r>
-        <w:t>=”col</w:t>
-      </w:r>
-      <w:proofErr w:type="gramEnd"/>
-      <w:r>
-        <w:t>-4”&gt;</w:t>
+        <w:t>&lt;div class=”col-4”&gt;</w:t>
       </w:r>
     </w:p>
     <w:p>
@@ -1882,15 +1583,7 @@
         <w:ind w:left="720" w:firstLine="720"/>
       </w:pPr>
       <w:r>
-        <w:t>&lt;form class</w:t>
-      </w:r>
-      <w:proofErr w:type="gramStart"/>
-      <w:r>
-        <w:t>=”col</w:t>
-      </w:r>
-      <w:proofErr w:type="gramEnd"/>
-      <w:r>
-        <w:t>-8”&gt;</w:t>
+        <w:t>&lt;form class=”col-8”&gt;</w:t>
       </w:r>
     </w:p>
     <w:p>
@@ -1900,15 +1593,7 @@
       </w:pPr>
       <w:r>
         <w:tab/>
-        <w:t>&lt;Input placeholder</w:t>
-      </w:r>
-      <w:proofErr w:type="gramStart"/>
-      <w:r>
-        <w:t>=”Search</w:t>
-      </w:r>
-      <w:proofErr w:type="gramEnd"/>
-      <w:r>
-        <w:t>” /&gt;</w:t>
+        <w:t>&lt;Input placeholder=”Search” /&gt;</w:t>
       </w:r>
     </w:p>
     <w:p>
@@ -1933,15 +1618,7 @@
         <w:ind w:firstLine="720"/>
       </w:pPr>
       <w:r>
-        <w:t>&lt;div class</w:t>
-      </w:r>
-      <w:proofErr w:type="gramStart"/>
-      <w:r>
-        <w:t>=”row</w:t>
-      </w:r>
-      <w:proofErr w:type="gramEnd"/>
-      <w:r>
-        <w:t xml:space="preserve"> hidden”&gt;</w:t>
+        <w:t>&lt;div class=”row hidden”&gt;</w:t>
       </w:r>
     </w:p>
     <w:p>
@@ -2009,15 +1686,8 @@
         <w:ind w:firstLine="720"/>
       </w:pPr>
       <w:r>
-        <w:t>&lt;div class</w:t>
-      </w:r>
-      <w:proofErr w:type="gramStart"/>
-      <w:r>
-        <w:t>=”row</w:t>
-      </w:r>
-      <w:proofErr w:type="gramEnd"/>
-      <w:r>
-        <w:t>”&gt;</w:t>
+        <w:lastRenderedPageBreak/>
+        <w:t>&lt;div class=”row”&gt;</w:t>
       </w:r>
     </w:p>
     <w:p>
@@ -2025,7 +1695,6 @@
         <w:pStyle w:val="Heading1"/>
       </w:pPr>
       <w:r>
-        <w:lastRenderedPageBreak/>
         <w:t>To Dos</w:t>
       </w:r>
     </w:p>
@@ -2095,14 +1764,12 @@
       <w:r>
         <w:t xml:space="preserve">At least partial solution by using </w:t>
       </w:r>
-      <w:proofErr w:type="spellStart"/>
       <w:r>
         <w:rPr>
           <w:b/>
         </w:rPr>
         <w:t>addEventListener</w:t>
       </w:r>
-      <w:proofErr w:type="spellEnd"/>
       <w:r>
         <w:t xml:space="preserve"> and using self (var self = this;)</w:t>
       </w:r>
@@ -2115,8 +1782,6 @@
           <w:numId w:val="4"/>
         </w:numPr>
       </w:pPr>
-      <w:bookmarkStart w:id="0" w:name="_GoBack"/>
-      <w:bookmarkEnd w:id="0"/>
       <w:r>
         <w:t>Spinner needs to compute it’s top and left locations</w:t>
       </w:r>
@@ -2625,7 +2290,7 @@
       </w:pPr>
     </w:pPrDefault>
   </w:docDefaults>
-  <w:latentStyles w:defLockedState="0" w:defUIPriority="99" w:defSemiHidden="0" w:defUnhideWhenUsed="0" w:defQFormat="0" w:count="375">
+  <w:latentStyles w:defLockedState="0" w:defUIPriority="99" w:defSemiHidden="0" w:defUnhideWhenUsed="0" w:defQFormat="0" w:count="377">
     <w:lsdException w:name="Normal" w:uiPriority="0" w:qFormat="1"/>
     <w:lsdException w:name="heading 1" w:uiPriority="9" w:qFormat="1"/>
     <w:lsdException w:name="heading 2" w:semiHidden="1" w:uiPriority="9" w:unhideWhenUsed="1" w:qFormat="1"/>
@@ -2731,7 +2396,6 @@
     <w:lsdException w:name="HTML Sample" w:semiHidden="1" w:unhideWhenUsed="1"/>
     <w:lsdException w:name="HTML Typewriter" w:semiHidden="1" w:unhideWhenUsed="1"/>
     <w:lsdException w:name="HTML Variable" w:semiHidden="1" w:unhideWhenUsed="1"/>
-    <w:lsdException w:name="Normal Table" w:semiHidden="1" w:unhideWhenUsed="1"/>
     <w:lsdException w:name="annotation subject" w:semiHidden="1" w:unhideWhenUsed="1"/>
     <w:lsdException w:name="No List" w:semiHidden="1" w:unhideWhenUsed="1"/>
     <w:lsdException w:name="Outline List 1" w:semiHidden="1" w:unhideWhenUsed="1"/>
@@ -2777,11 +2441,9 @@
     <w:lsdException w:name="Table Subtle 1" w:semiHidden="1" w:unhideWhenUsed="1"/>
     <w:lsdException w:name="Table Subtle 2" w:semiHidden="1" w:unhideWhenUsed="1"/>
     <w:lsdException w:name="Table Web 1" w:semiHidden="1" w:unhideWhenUsed="1"/>
-    <w:lsdException w:name="Table Web 2" w:semiHidden="1" w:unhideWhenUsed="1"/>
     <w:lsdException w:name="Table Web 3" w:semiHidden="1" w:unhideWhenUsed="1"/>
     <w:lsdException w:name="Balloon Text" w:semiHidden="1" w:unhideWhenUsed="1"/>
     <w:lsdException w:name="Table Grid" w:uiPriority="39"/>
-    <w:lsdException w:name="Table Theme" w:semiHidden="1" w:unhideWhenUsed="1"/>
     <w:lsdException w:name="Placeholder Text" w:semiHidden="1"/>
     <w:lsdException w:name="No Spacing" w:uiPriority="1" w:qFormat="1"/>
     <w:lsdException w:name="Light Shading" w:uiPriority="60"/>
@@ -3001,6 +2663,8 @@
     <w:lsdException w:name="Smart Hyperlink" w:semiHidden="1" w:unhideWhenUsed="1"/>
     <w:lsdException w:name="Hashtag" w:semiHidden="1" w:unhideWhenUsed="1"/>
     <w:lsdException w:name="Unresolved Mention" w:semiHidden="1" w:unhideWhenUsed="1"/>
+    <w:lsdException w:name="Smart Link" w:semiHidden="1" w:unhideWhenUsed="1"/>
+    <w:lsdException w:name="Smart Link Error" w:semiHidden="1" w:unhideWhenUsed="1"/>
   </w:latentStyles>
   <w:style w:type="paragraph" w:default="1" w:styleId="Normal">
     <w:name w:val="Normal"/>

</xml_diff>